<commit_message>
feat: ccd.llm (DeepSeek/SERPRO), geradores nereu (retomada/MPC/arquivamento/SEAD), rastreio FRAP, monitoramento obrigacoes, docs e skills
</commit_message>
<xml_diff>
--- a/processos/modelos/nereu_baixa.docx
+++ b/processos/modelos/nereu_baixa.docx
@@ -274,6 +274,69 @@
           <w:szCs w:val="22"/>
         </w:rPr>
         <w:t>{{status}}</w:t>
+      </w:r>
+    </w:p>
+    <w:p>
+      <w:pPr>
+        <w:pStyle w:val="Default"/>
+        <w:spacing w:before="120" w:after="120" w:line="276" w:lineRule="auto"/>
+        <w:ind w:firstLine="1134"/>
+        <w:jc w:val="both"/>
+        <w:rPr>
+          <w:rFonts w:ascii="Arial" w:hAnsi="Arial" w:cs="Arial"/>
+          <w:sz w:val="22"/>
+          <w:szCs w:val="22"/>
+        </w:rPr>
+      </w:pPr>
+      <w:r>
+        <w:rPr>
+          <w:rFonts w:ascii="Arial" w:hAnsi="Arial" w:cs="Arial"/>
+          <w:sz w:val="22"/>
+          <w:szCs w:val="22"/>
+        </w:rPr>
+        <w:t>{%p if sobrestamento %}</w:t>
+      </w:r>
+    </w:p>
+    <w:p>
+      <w:pPr>
+        <w:pStyle w:val="Default"/>
+        <w:spacing w:before="120" w:after="120" w:line="276" w:lineRule="auto"/>
+        <w:ind w:firstLine="1134"/>
+        <w:jc w:val="both"/>
+        <w:rPr>
+          <w:rFonts w:ascii="Arial" w:hAnsi="Arial" w:cs="Arial"/>
+          <w:sz w:val="22"/>
+          <w:szCs w:val="22"/>
+        </w:rPr>
+      </w:pPr>
+      <w:r>
+        <w:rPr>
+          <w:rFonts w:ascii="Arial" w:hAnsi="Arial" w:cs="Arial"/>
+          <w:sz w:val="22"/>
+          <w:szCs w:val="22"/>
+        </w:rPr>
+        <w:t>{{sobrestamento}}</w:t>
+      </w:r>
+    </w:p>
+    <w:p>
+      <w:pPr>
+        <w:pStyle w:val="Default"/>
+        <w:spacing w:before="120" w:after="120" w:line="276" w:lineRule="auto"/>
+        <w:ind w:firstLine="1134"/>
+        <w:jc w:val="both"/>
+        <w:rPr>
+          <w:rFonts w:ascii="Arial" w:hAnsi="Arial" w:cs="Arial"/>
+          <w:sz w:val="22"/>
+          <w:szCs w:val="22"/>
+        </w:rPr>
+      </w:pPr>
+      <w:r>
+        <w:rPr>
+          <w:rFonts w:ascii="Arial" w:hAnsi="Arial" w:cs="Arial"/>
+          <w:sz w:val="22"/>
+          <w:szCs w:val="22"/>
+        </w:rPr>
+        <w:t>{%p endif %}</w:t>
       </w:r>
     </w:p>
     <w:p>

</xml_diff>